<commit_message>
Update resume content while preserving Drive document format
</commit_message>
<xml_diff>
--- a/public/resume/SeMinKong-Resume.docx
+++ b/public/resume/SeMinKong-Resume.docx
@@ -48,7 +48,7 @@
           <w:szCs w:val="17"/>
           <w:rtl w:val="0"/>
         </w:rPr>
-        <w:t>SOFTWARE | VISION | ROBOTICS</w:t>
+        <w:t xml:space="preserve">SOFTWARE DEVELOPER</w:t>
       </w:r>
       <w:r>
         <w:rPr>
@@ -62,7 +62,7 @@
         <w:keepLines w:val="1"/>
         <w:widowControl w:val="1"/>
         <w:pBdr>
-          <w:bottom w:color="17365d" w:space="3" w:sz="10" w:val="single"/>
+          <w:bottom w:color="000000" w:space="3" w:sz="10" w:val="single"/>
         </w:pBdr>
         <w:spacing w:after="40" w:lineRule="auto"/>
         <w:jc w:val="center"/>
@@ -129,7 +129,7 @@
         <w:pBdr>
           <w:top w:space="0" w:sz="0" w:val="nil"/>
           <w:left w:space="0" w:sz="0" w:val="nil"/>
-          <w:bottom w:color="b8c5d6" w:space="2" w:sz="6" w:val="single"/>
+          <w:bottom w:color="000000" w:space="2" w:sz="6" w:val="single"/>
           <w:right w:space="0" w:sz="0" w:val="nil"/>
           <w:between w:space="0" w:sz="0" w:val="nil"/>
         </w:pBdr>
@@ -188,7 +188,7 @@
           <w:i w:val="0"/>
           <w:sz w:val="18"/>
         </w:rPr>
-        <w:t>Software engineering graduate who enjoys learning new technologies and turning ideas into working systems. Project experience spans computer vision, ROS 2, backend services, and hardware integration, with a focus on clear interfaces, observable behavior, and end-to-end implementation.</w:t>
+        <w:t xml:space="preserve">Software engineering graduate with experience connecting computer vision, ROS 2, backend services, and hardware integration to build working systems. I enjoy learning new technologies and turning ideas into systems that I can build and test.</w:t>
       </w:r>
     </w:p>
     <w:p>
@@ -200,7 +200,7 @@
         <w:pBdr>
           <w:top w:space="0" w:sz="0" w:val="nil"/>
           <w:left w:space="0" w:sz="0" w:val="nil"/>
-          <w:bottom w:color="b8c5d6" w:space="2" w:sz="6" w:val="single"/>
+          <w:bottom w:color="000000" w:space="2" w:sz="6" w:val="single"/>
           <w:right w:space="0" w:sz="0" w:val="nil"/>
           <w:between w:space="0" w:sz="0" w:val="nil"/>
         </w:pBdr>
@@ -501,7 +501,7 @@
         <w:pBdr>
           <w:top w:space="0" w:sz="0" w:val="nil"/>
           <w:left w:space="0" w:sz="0" w:val="nil"/>
-          <w:bottom w:color="b8c5d6" w:space="2" w:sz="6" w:val="single"/>
+          <w:bottom w:color="000000" w:space="2" w:sz="6" w:val="single"/>
           <w:right w:space="0" w:sz="0" w:val="nil"/>
           <w:between w:space="0" w:sz="0" w:val="nil"/>
         </w:pBdr>
@@ -671,7 +671,7 @@
         <w:pBdr>
           <w:top w:space="0" w:sz="0" w:val="nil"/>
           <w:left w:space="0" w:sz="0" w:val="nil"/>
-          <w:bottom w:color="b8c5d6" w:space="2" w:sz="6" w:val="single"/>
+          <w:bottom w:color="000000" w:space="2" w:sz="6" w:val="single"/>
           <w:right w:space="0" w:sz="0" w:val="nil"/>
           <w:between w:space="0" w:sz="0" w:val="nil"/>
         </w:pBdr>
@@ -1010,7 +1010,7 @@
         <w:pBdr>
           <w:top w:space="0" w:sz="0" w:val="nil"/>
           <w:left w:space="0" w:sz="0" w:val="nil"/>
-          <w:bottom w:color="b8c5d6" w:space="2" w:sz="6" w:val="single"/>
+          <w:bottom w:color="000000" w:space="2" w:sz="6" w:val="single"/>
           <w:right w:space="0" w:sz="0" w:val="nil"/>
           <w:between w:space="0" w:sz="0" w:val="nil"/>
         </w:pBdr>
@@ -1051,7 +1051,7 @@
           <w:vertAlign w:val="baseline"/>
           <w:rtl w:val="0"/>
         </w:rPr>
-        <w:t>PROJECTS</w:t>
+        <w:t xml:space="preserve">SELECTED PROJECTS</w:t>
       </w:r>
     </w:p>
     <w:p>
@@ -1159,7 +1159,7 @@
           <w:i/>
           <w:sz w:val="17"/>
         </w:rPr>
-        <w:t xml:space="preserve">ROS 2 | MediaPipe Hands | OpenCV | Jetson | Raspberry Pi 5 | DYNAMIXEL XL330 | React | </w:t>
+        <w:t xml:space="preserve">ROS 2 | MediaPipe | OpenCV | Jetson | Raspberry Pi 5 | DYNAMIXEL | React | Django | AWS EC2 | </w:t>
       </w:r>
       <w:hyperlink r:id="rId13">
         <w:r>
@@ -1170,7 +1170,7 @@
             <w:color w:val="000000"/>
             <w:u w:val="single"/>
           </w:rPr>
-          <w:t>Case Study</w:t>
+          <w:t xml:space="preserve">Case Study</w:t>
         </w:r>
       </w:hyperlink>
     </w:p>
@@ -1204,7 +1204,7 @@
           <w:i w:val="0"/>
           <w:sz w:val="17"/>
         </w:rPr>
-        <w:t>Team-built a human-mimetic tendon hand that maps 21 MediaPipe landmarks to a seven-axis HandCommand and drives seven DYNAMIXEL XL330 actuators through ROS 2.</w:t>
+        <w:t xml:space="preserve">Team project mapping 21 MediaPipe hand landmarks to a seven-axis HandCommand.</w:t>
       </w:r>
     </w:p>
     <w:p>
@@ -1237,7 +1237,7 @@
           <w:i w:val="0"/>
           <w:sz w:val="17"/>
         </w:rPr>
-        <w:t>Integrated Jetson perception, Raspberry Pi 5 command mediation, Command Guard and GPIO E-Stop, React monitoring, and rosbag2-to-EC2 experiment records.</w:t>
+        <w:t xml:space="preserve">Handled Blender modeling, 3D printing, synchronized seven-motor control and U2D2 communication, ROS bridge and Cyclone DDS configuration, and tendon mechanism integration.</w:t>
       </w:r>
     </w:p>
     <w:p>
@@ -1345,7 +1345,7 @@
           <w:i/>
           <w:sz w:val="17"/>
         </w:rPr>
-        <w:t xml:space="preserve">ROS 2 | FastAPI | WebSocket | React | RealSense | Dobot | YOLOv5 | </w:t>
+        <w:t xml:space="preserve">ROS 2 | FastAPI | React | RealSense | Dobot | YOLOv5 | RoboDK | </w:t>
       </w:r>
       <w:hyperlink r:id="rId9">
         <w:r>
@@ -1356,7 +1356,7 @@
             <w:color w:val="000000"/>
             <w:u w:val="single"/>
           </w:rPr>
-          <w:t>Repository</w:t>
+          <w:t xml:space="preserve">Repository</w:t>
         </w:r>
       </w:hyperlink>
     </w:p>
@@ -1390,7 +1390,7 @@
           <w:i w:val="0"/>
           <w:sz w:val="17"/>
         </w:rPr>
-        <w:t>Led full-stack and robot integration on a two-person team for a smart-factory system: RealSense + YOLOv5 inspection triggered conveyor stops and Dobot vacuum pick-and-place.</w:t>
+        <w:t xml:space="preserve">Team project spanning physical inspection and Dobot sorting, RoboDK process simulation, and SLAM-based robot monitoring.</w:t>
       </w:r>
     </w:p>
     <w:p>
@@ -1423,7 +1423,7 @@
           <w:i w:val="0"/>
           <w:sz w:val="17"/>
         </w:rPr>
-        <w:t>Built the RealOps dashboard, FastAPI REST/WebSocket services, ROS 2 bridge, device adapters, and LLM command integration for live monitoring and control.</w:t>
+        <w:t xml:space="preserve">Trained YOLO; configured the integrated ROS environment, RealOps and separate MJPEG video streams, package-based navigation to designated goals, and RoboDK command/state relay.</w:t>
       </w:r>
     </w:p>
     <w:p>
@@ -1645,7 +1645,7 @@
           <w:vertAlign w:val="baseline"/>
           <w:rtl w:val="0"/>
         </w:rPr>
-        <w:t xml:space="preserve">Built a unified YOLO11 classification and instance-segmentation pipeline for four MRI classes, combining diagnosis and tumor-mask visualization in one output.</w:t>
+        <w:t xml:space="preserve">Implemented YOLO11 classification and segmentation, mask-to-polygon preprocessing, and a unified inference interface.</w:t>
       </w:r>
     </w:p>
     <w:p>
@@ -1688,7 +1688,7 @@
           <w:vertAlign w:val="baseline"/>
           <w:rtl w:val="0"/>
         </w:rPr>
-        <w:t xml:space="preserve">Automated grayscale mask-to-polygon label conversion; reported 99.4% Top-1 accuracy and 92.7% Mask mAP50 in project evaluations.</w:t>
+        <w:t xml:space="preserve">Performance verification with independent evaluation data and execution logs remains to be completed.</w:t>
       </w:r>
     </w:p>
     <w:p>
@@ -1910,7 +1910,7 @@
           <w:vertAlign w:val="baseline"/>
           <w:rtl w:val="0"/>
         </w:rPr>
-        <w:t xml:space="preserve">Built a real-time multiplayer browser game with a React/TypeScript frontend and Node.js/Express/Socket.io backend.</w:t>
+        <w:t xml:space="preserve">Built a real-time multiplayer game with React and Socket.io.</w:t>
       </w:r>
     </w:p>
     <w:p>
@@ -1953,60 +1953,7 @@
           <w:vertAlign w:val="baseline"/>
           <w:rtl w:val="0"/>
         </w:rPr>
-        <w:t xml:space="preserve">Implemented a server-authoritative 60 FPS physics engine for elastic collisions, friction, momentum, position correction, and dynamic mass/radius scaling.</w:t>
-      </w:r>
-    </w:p>
-    <w:p>
-      <w:pPr>
-        <w:keepNext w:val="1"/>
-        <w:keepLines w:val="1"/>
-        <w:pageBreakBefore w:val="0"/>
-        <w:widowControl w:val="1"/>
-        <w:pBdr>
-          <w:top w:space="0" w:sz="0" w:val="nil"/>
-          <w:left w:space="0" w:sz="0" w:val="nil"/>
-          <w:bottom w:color="b8c5d6" w:space="2" w:sz="6" w:val="single"/>
-          <w:right w:space="0" w:sz="0" w:val="nil"/>
-          <w:between w:space="0" w:sz="0" w:val="nil"/>
-        </w:pBdr>
-        <w:shd w:fill="auto" w:val="clear"/>
-        <w:spacing w:after="48" w:before="100" w:line="240" w:lineRule="auto"/>
-        <w:ind w:left="0" w:right="0" w:firstLine="0"/>
-        <w:jc w:val="left"/>
-        <w:rPr>
-          <w:rFonts w:ascii="Arial" w:cs="Arial" w:eastAsia="Arial" w:hAnsi="Arial"/>
-          <w:b w:val="1"/>
-          <w:bCs w:val="1"/>
-          <w:i w:val="0"/>
-          <w:iCs w:val="0"/>
-          <w:smallCaps w:val="0"/>
-          <w:strike w:val="0"/>
-          <w:color w:val="000000"/>
-          <w:sz w:val="20"/>
-          <w:szCs w:val="20"/>
-          <w:u w:val="none"/>
-          <w:shd w:fill="auto" w:val="clear"/>
-          <w:vertAlign w:val="baseline"/>
-        </w:rPr>
-      </w:pPr>
-      <w:r>
-        <w:rPr>
-          <w:rFonts w:ascii="Arial" w:cs="Arial" w:eastAsia="Arial" w:hAnsi="Arial"/>
-          <w:b w:val="1"/>
-          <w:bCs w:val="1"/>
-          <w:i w:val="0"/>
-          <w:iCs w:val="0"/>
-          <w:smallCaps w:val="0"/>
-          <w:strike w:val="0"/>
-          <w:color w:val="000000"/>
-          <w:sz w:val="20"/>
-          <w:szCs w:val="20"/>
-          <w:u w:val="none"/>
-          <w:shd w:fill="auto" w:val="clear"/>
-          <w:vertAlign w:val="baseline"/>
-          <w:rtl w:val="0"/>
-        </w:rPr>
-        <w:t xml:space="preserve">AWARDS &amp; CERTIFICATIONS</w:t>
+        <w:t xml:space="preserve">Implemented server-authoritative state, input limits, and collision, friction, and position-correction calculations.</w:t>
       </w:r>
     </w:p>
     <w:p>
@@ -2047,43 +1994,284 @@
       </w:pPr>
       <w:r>
         <w:rPr>
-          <w:rFonts w:ascii="Arial" w:hAnsi="Arial" w:eastAsia="Arial" w:cs="Arial"/>
-          <w:b/>
-          <w:i w:val="0"/>
-          <w:sz w:val="18"/>
-          <w:u w:val="none"/>
-        </w:rPr>
-        <w:t>SSAFY Common Project - Excellence Award</w:t>
-      </w:r>
-      <w:r>
-        <w:rPr>
-          <w:rFonts w:ascii="Arial" w:hAnsi="Arial" w:eastAsia="Arial" w:cs="Arial"/>
-          <w:b w:val="0"/>
-          <w:i w:val="0"/>
-          <w:sz w:val="18"/>
-          <w:u w:val="none"/>
-        </w:rPr>
-        <w:t xml:space="preserve"> | AIoT Track, Gwangju Class 1 (1st Place)</w:t>
-      </w:r>
-      <w:r>
-        <w:rPr>
-          <w:rFonts w:ascii="Arial" w:hAnsi="Arial" w:eastAsia="Arial" w:cs="Arial"/>
-          <w:b/>
-          <w:i w:val="0"/>
-          <w:sz w:val="17"/>
-          <w:u w:val="none"/>
+          <w:rFonts w:ascii="Arial" w:cs="Arial" w:eastAsia="Arial" w:hAnsi="Arial"/>
+          <w:b w:val="1"/>
+          <w:bCs w:val="1"/>
+          <w:i w:val="0"/>
+          <w:iCs w:val="0"/>
+          <w:smallCaps w:val="0"/>
+          <w:strike w:val="0"/>
+          <w:color w:val="000000"/>
+          <w:sz w:val="18"/>
+          <w:szCs w:val="18"/>
+          <w:u w:val="none"/>
+          <w:shd w:fill="auto" w:val="clear"/>
+          <w:vertAlign w:val="baseline"/>
+          <w:rtl w:val="0"/>
+        </w:rPr>
+        <w:t xml:space="preserve">Briefit</w:t>
+      </w:r>
+      <w:r>
+        <w:rPr>
+          <w:rFonts w:ascii="Arial" w:cs="Arial" w:eastAsia="Arial" w:hAnsi="Arial"/>
+          <w:b w:val="0"/>
+          <w:bCs w:val="0"/>
+          <w:i w:val="0"/>
+          <w:iCs w:val="0"/>
+          <w:smallCaps w:val="0"/>
+          <w:strike w:val="0"/>
+          <w:color w:val="000000"/>
+          <w:sz w:val="18"/>
+          <w:szCs w:val="18"/>
+          <w:u w:val="none"/>
+          <w:shd w:fill="auto" w:val="clear"/>
+          <w:vertAlign w:val="baseline"/>
+          <w:rtl w:val="0"/>
+        </w:rPr>
+        <w:t xml:space="preserve"> | Team AI Engineer, AI-Based News Curation</w:t>
+      </w:r>
+      <w:r>
+        <w:rPr>
+          <w:rFonts w:ascii="Arial" w:cs="Arial" w:eastAsia="Arial" w:hAnsi="Arial"/>
+          <w:b w:val="1"/>
+          <w:bCs w:val="1"/>
+          <w:i w:val="0"/>
+          <w:iCs w:val="0"/>
+          <w:smallCaps w:val="0"/>
+          <w:strike w:val="0"/>
+          <w:color w:val="000000"/>
+          <w:sz w:val="17"/>
+          <w:szCs w:val="17"/>
+          <w:u w:val="none"/>
+          <w:shd w:fill="auto" w:val="clear"/>
+          <w:vertAlign w:val="baseline"/>
+          <w:rtl w:val="0"/>
         </w:rPr>
         <w:tab/>
-      </w:r>
-      <w:r>
-        <w:rPr>
-          <w:rFonts w:ascii="Arial" w:hAnsi="Arial" w:eastAsia="Arial" w:cs="Arial"/>
-          <w:b/>
-          <w:i w:val="0"/>
-          <w:sz w:val="17"/>
-          <w:u w:val="none"/>
-        </w:rPr>
-        <w:t>10 Aug 2026</w:t>
+        <w:t xml:space="preserve">May 2025 - Sep 2025</w:t>
+      </w:r>
+      <w:r>
+        <w:rPr>
+          <w:rtl w:val="0"/>
+        </w:rPr>
+      </w:r>
+    </w:p>
+    <w:p>
+      <w:pPr>
+        <w:keepNext w:val="1"/>
+        <w:keepLines w:val="1"/>
+        <w:pageBreakBefore w:val="0"/>
+        <w:widowControl w:val="1"/>
+        <w:pBdr>
+          <w:top w:space="0" w:sz="0" w:val="nil"/>
+          <w:left w:space="0" w:sz="0" w:val="nil"/>
+          <w:bottom w:space="0" w:sz="0" w:val="nil"/>
+          <w:right w:space="0" w:sz="0" w:val="nil"/>
+          <w:between w:space="0" w:sz="0" w:val="nil"/>
+        </w:pBdr>
+        <w:shd w:fill="auto" w:val="clear"/>
+        <w:spacing w:after="16" w:before="0" w:line="240" w:lineRule="auto"/>
+        <w:ind w:left="0" w:right="0" w:firstLine="0"/>
+        <w:jc w:val="left"/>
+        <w:rPr>
+          <w:rFonts w:ascii="Arial" w:cs="Arial" w:eastAsia="Arial" w:hAnsi="Arial"/>
+          <w:b w:val="0"/>
+          <w:bCs w:val="0"/>
+          <w:i w:val="0"/>
+          <w:iCs w:val="0"/>
+          <w:smallCaps w:val="0"/>
+          <w:strike w:val="0"/>
+          <w:color w:val="000000"/>
+          <w:sz w:val="17"/>
+          <w:szCs w:val="17"/>
+          <w:u w:val="none"/>
+          <w:shd w:fill="auto" w:val="clear"/>
+          <w:vertAlign w:val="baseline"/>
+        </w:rPr>
+      </w:pPr>
+      <w:r>
+        <w:rPr>
+          <w:rFonts w:ascii="Arial" w:cs="Arial" w:eastAsia="Arial" w:hAnsi="Arial"/>
+          <w:b w:val="0"/>
+          <w:bCs w:val="0"/>
+          <w:i w:val="1"/>
+          <w:iCs w:val="1"/>
+          <w:smallCaps w:val="0"/>
+          <w:strike w:val="0"/>
+          <w:color w:val="000000"/>
+          <w:sz w:val="17"/>
+          <w:szCs w:val="17"/>
+          <w:u w:val="none"/>
+          <w:shd w:fill="auto" w:val="clear"/>
+          <w:vertAlign w:val="baseline"/>
+          <w:rtl w:val="0"/>
+        </w:rPr>
+        <w:t xml:space="preserve">Python | aiohttp | BeautifulSoup | Transformers | KoBART | </w:t>
+      </w:r>
+      <w:hyperlink r:id="rId10">
+        <w:r>
+          <w:rPr>
+            <w:rFonts w:ascii="Arial" w:cs="Arial" w:eastAsia="Arial" w:hAnsi="Arial"/>
+            <w:b w:val="0"/>
+            <w:bCs w:val="0"/>
+            <w:i w:val="0"/>
+            <w:iCs w:val="0"/>
+            <w:smallCaps w:val="0"/>
+            <w:strike w:val="0"/>
+            <w:color w:val="000000"/>
+            <w:sz w:val="17"/>
+            <w:szCs w:val="17"/>
+            <w:u w:val="single"/>
+            <w:shd w:fill="auto" w:val="clear"/>
+            <w:vertAlign w:val="baseline"/>
+            <w:rtl w:val="0"/>
+          </w:rPr>
+          <w:t xml:space="preserve">Repository</w:t>
+        </w:r>
+      </w:hyperlink>
+      <w:r>
+        <w:rPr>
+          <w:rtl w:val="0"/>
+        </w:rPr>
+      </w:r>
+    </w:p>
+    <w:p>
+      <w:pPr>
+        <w:keepNext w:val="0"/>
+        <w:keepLines w:val="1"/>
+        <w:pageBreakBefore w:val="0"/>
+        <w:widowControl w:val="1"/>
+        <w:numPr>
+          <w:ilvl w:val="0"/>
+          <w:numId w:val="1"/>
+        </w:numPr>
+        <w:pBdr>
+          <w:top w:space="0" w:sz="0" w:val="nil"/>
+          <w:left w:space="0" w:sz="0" w:val="nil"/>
+          <w:bottom w:space="0" w:sz="0" w:val="nil"/>
+          <w:right w:space="0" w:sz="0" w:val="nil"/>
+          <w:between w:space="0" w:sz="0" w:val="nil"/>
+        </w:pBdr>
+        <w:shd w:fill="auto" w:val="clear"/>
+        <w:spacing w:after="16" w:before="0" w:line="240" w:lineRule="auto"/>
+        <w:ind w:left="350" w:right="0" w:hanging="180"/>
+        <w:jc w:val="left"/>
+        <w:rPr/>
+      </w:pPr>
+      <w:r>
+        <w:rPr>
+          <w:rFonts w:ascii="Arial" w:cs="Arial" w:eastAsia="Arial" w:hAnsi="Arial"/>
+          <w:b w:val="0"/>
+          <w:bCs w:val="0"/>
+          <w:i w:val="0"/>
+          <w:iCs w:val="0"/>
+          <w:smallCaps w:val="0"/>
+          <w:strike w:val="0"/>
+          <w:color w:val="000000"/>
+          <w:sz w:val="17"/>
+          <w:szCs w:val="17"/>
+          <w:u w:val="none"/>
+          <w:shd w:fill="auto" w:val="clear"/>
+          <w:vertAlign w:val="baseline"/>
+          <w:rtl w:val="0"/>
+        </w:rPr>
+        <w:t xml:space="preserve">Team news curation service for browsing articles from multiple outlets and reading summaries. Collected and cleaned about 4,000 articles with Crawl4AI and fine-tuned KoBART on about 3,000.</w:t>
+      </w:r>
+    </w:p>
+    <w:p>
+      <w:pPr>
+        <w:keepNext w:val="0"/>
+        <w:keepLines w:val="1"/>
+        <w:pageBreakBefore w:val="0"/>
+        <w:widowControl w:val="1"/>
+        <w:numPr>
+          <w:ilvl w:val="0"/>
+          <w:numId w:val="1"/>
+        </w:numPr>
+        <w:pBdr>
+          <w:top w:space="0" w:sz="0" w:val="nil"/>
+          <w:left w:space="0" w:sz="0" w:val="nil"/>
+          <w:bottom w:space="0" w:sz="0" w:val="nil"/>
+          <w:right w:space="0" w:sz="0" w:val="nil"/>
+          <w:between w:space="0" w:sz="0" w:val="nil"/>
+        </w:pBdr>
+        <w:shd w:fill="auto" w:val="clear"/>
+        <w:spacing w:after="16" w:before="0" w:line="240" w:lineRule="auto"/>
+        <w:ind w:left="350" w:right="0" w:hanging="180"/>
+        <w:jc w:val="left"/>
+        <w:rPr/>
+      </w:pPr>
+      <w:r>
+        <w:rPr>
+          <w:rFonts w:ascii="Arial" w:cs="Arial" w:eastAsia="Arial" w:hAnsi="Arial"/>
+          <w:b w:val="0"/>
+          <w:bCs w:val="0"/>
+          <w:i w:val="0"/>
+          <w:iCs w:val="0"/>
+          <w:smallCaps w:val="0"/>
+          <w:strike w:val="0"/>
+          <w:color w:val="000000"/>
+          <w:sz w:val="17"/>
+          <w:szCs w:val="17"/>
+          <w:u w:val="none"/>
+          <w:shd w:fill="auto" w:val="clear"/>
+          <w:vertAlign w:val="baseline"/>
+          <w:rtl w:val="0"/>
+        </w:rPr>
+        <w:t xml:space="preserve">Compared T5 and KoBART with ROUGE and integrated the Gemini API to improve service summaries.</w:t>
+      </w:r>
+    </w:p>
+    <w:p>
+      <w:pPr>
+        <w:keepNext w:val="1"/>
+        <w:keepLines w:val="1"/>
+        <w:pageBreakBefore w:val="0"/>
+        <w:widowControl w:val="1"/>
+        <w:pBdr>
+          <w:top w:space="0" w:sz="0" w:val="nil"/>
+          <w:left w:space="0" w:sz="0" w:val="nil"/>
+          <w:bottom w:color="000000" w:space="2" w:sz="6" w:val="single"/>
+          <w:right w:space="0" w:sz="0" w:val="nil"/>
+          <w:between w:space="0" w:sz="0" w:val="nil"/>
+        </w:pBdr>
+        <w:shd w:fill="auto" w:val="clear"/>
+        <w:spacing w:after="48" w:before="100" w:line="240" w:lineRule="auto"/>
+        <w:ind w:left="0" w:right="0" w:firstLine="0"/>
+        <w:jc w:val="left"/>
+        <w:rPr>
+          <w:rFonts w:ascii="Arial" w:cs="Arial" w:eastAsia="Arial" w:hAnsi="Arial"/>
+          <w:b w:val="1"/>
+          <w:bCs w:val="1"/>
+          <w:i w:val="0"/>
+          <w:iCs w:val="0"/>
+          <w:smallCaps w:val="0"/>
+          <w:strike w:val="0"/>
+          <w:color w:val="000000"/>
+          <w:sz w:val="20"/>
+          <w:szCs w:val="20"/>
+          <w:u w:val="none"/>
+          <w:shd w:fill="auto" w:val="clear"/>
+          <w:vertAlign w:val="baseline"/>
+        </w:rPr>
+      </w:pPr>
+      <w:r>
+        <w:rPr>
+          <w:rFonts w:ascii="Arial" w:cs="Arial" w:eastAsia="Arial" w:hAnsi="Arial"/>
+          <w:b w:val="1"/>
+          <w:bCs w:val="1"/>
+          <w:i w:val="0"/>
+          <w:iCs w:val="0"/>
+          <w:smallCaps w:val="0"/>
+          <w:strike w:val="0"/>
+          <w:color w:val="000000"/>
+          <w:sz w:val="20"/>
+          <w:szCs w:val="20"/>
+          <w:u w:val="none"/>
+          <w:shd w:fill="auto" w:val="clear"/>
+          <w:vertAlign w:val="baseline"/>
+          <w:rtl w:val="0"/>
+        </w:rPr>
+        <w:t xml:space="preserve">AWARDS &amp; CERTIFICATIONS</w:t>
       </w:r>
     </w:p>
     <w:p>
@@ -2124,43 +2312,75 @@
       </w:pPr>
       <w:r>
         <w:rPr>
-          <w:rFonts w:ascii="Arial" w:hAnsi="Arial" w:eastAsia="Arial" w:cs="Arial"/>
-          <w:b/>
-          <w:i w:val="0"/>
-          <w:sz w:val="18"/>
-          <w:u w:val="none"/>
-        </w:rPr>
-        <w:t>2025 IT Project Pro League - Encouragement Award</w:t>
-      </w:r>
-      <w:r>
-        <w:rPr>
-          <w:rFonts w:ascii="Arial" w:hAnsi="Arial" w:eastAsia="Arial" w:cs="Arial"/>
-          <w:b w:val="0"/>
-          <w:i w:val="0"/>
-          <w:sz w:val="18"/>
-          <w:u w:val="none"/>
-        </w:rPr>
-        <w:t xml:space="preserve"> | Soongsil University Spartan SW Education Center</w:t>
-      </w:r>
-      <w:r>
-        <w:rPr>
-          <w:rFonts w:ascii="Arial" w:hAnsi="Arial" w:eastAsia="Arial" w:cs="Arial"/>
-          <w:b/>
-          <w:i w:val="0"/>
-          <w:sz w:val="17"/>
-          <w:u w:val="none"/>
+          <w:rFonts w:ascii="Arial" w:cs="Arial" w:eastAsia="Arial" w:hAnsi="Arial"/>
+          <w:b w:val="1"/>
+          <w:bCs w:val="1"/>
+          <w:i w:val="0"/>
+          <w:iCs w:val="0"/>
+          <w:smallCaps w:val="0"/>
+          <w:strike w:val="0"/>
+          <w:color w:val="000000"/>
+          <w:sz w:val="18"/>
+          <w:szCs w:val="18"/>
+          <w:u w:val="none"/>
+          <w:shd w:fill="auto" w:val="clear"/>
+          <w:vertAlign w:val="baseline"/>
+          <w:rtl w:val="0"/>
+        </w:rPr>
+        <w:t xml:space="preserve">SSAFY Common Project - Excellence Award</w:t>
+      </w:r>
+      <w:r>
+        <w:rPr>
+          <w:rFonts w:ascii="Arial" w:cs="Arial" w:eastAsia="Arial" w:hAnsi="Arial"/>
+          <w:b w:val="0"/>
+          <w:bCs w:val="0"/>
+          <w:i w:val="0"/>
+          <w:iCs w:val="0"/>
+          <w:smallCaps w:val="0"/>
+          <w:strike w:val="0"/>
+          <w:color w:val="000000"/>
+          <w:sz w:val="18"/>
+          <w:szCs w:val="18"/>
+          <w:u w:val="none"/>
+          <w:shd w:fill="auto" w:val="clear"/>
+          <w:vertAlign w:val="baseline"/>
+          <w:rtl w:val="0"/>
+        </w:rPr>
+        <w:t xml:space="preserve"> | AIoT Track, Gwangju Class 1 (1st Place)</w:t>
+      </w:r>
+      <w:r>
+        <w:rPr>
+          <w:b w:val="1"/>
+          <w:bCs w:val="1"/>
+          <w:sz w:val="17"/>
+          <w:szCs w:val="17"/>
+          <w:rtl w:val="0"/>
         </w:rPr>
         <w:tab/>
       </w:r>
       <w:r>
         <w:rPr>
-          <w:rFonts w:ascii="Arial" w:hAnsi="Arial" w:eastAsia="Arial" w:cs="Arial"/>
-          <w:b/>
-          <w:i w:val="0"/>
-          <w:sz w:val="17"/>
-          <w:u w:val="none"/>
-        </w:rPr>
-        <w:t>22 Nov 2025</w:t>
+          <w:rFonts w:ascii="Arial" w:cs="Arial" w:eastAsia="Arial" w:hAnsi="Arial"/>
+          <w:b w:val="1"/>
+          <w:bCs w:val="1"/>
+          <w:i w:val="0"/>
+          <w:iCs w:val="0"/>
+          <w:smallCaps w:val="0"/>
+          <w:strike w:val="0"/>
+          <w:color w:val="000000"/>
+          <w:sz w:val="17"/>
+          <w:szCs w:val="17"/>
+          <w:u w:val="none"/>
+          <w:shd w:fill="auto" w:val="clear"/>
+          <w:vertAlign w:val="baseline"/>
+          <w:rtl w:val="0"/>
+        </w:rPr>
+        <w:t xml:space="preserve">10 Aug 2026</w:t>
+      </w:r>
+      <w:r>
+        <w:rPr>
+          <w:rtl w:val="0"/>
+        </w:rPr>
       </w:r>
     </w:p>
     <w:p>
@@ -2201,43 +2421,75 @@
       </w:pPr>
       <w:r>
         <w:rPr>
-          <w:rFonts w:ascii="Arial" w:hAnsi="Arial" w:eastAsia="Arial" w:cs="Arial"/>
-          <w:b/>
-          <w:i w:val="0"/>
-          <w:sz w:val="18"/>
-          <w:u w:val="none"/>
-        </w:rPr>
-        <w:t>2025 College of IT Software Competition - Gold Prize</w:t>
-      </w:r>
-      <w:r>
-        <w:rPr>
-          <w:rFonts w:ascii="Arial" w:hAnsi="Arial" w:eastAsia="Arial" w:cs="Arial"/>
-          <w:b w:val="0"/>
-          <w:i w:val="0"/>
-          <w:sz w:val="18"/>
-          <w:u w:val="none"/>
-        </w:rPr>
-        <w:t xml:space="preserve"> | Soongsil University College of IT</w:t>
-      </w:r>
-      <w:r>
-        <w:rPr>
-          <w:rFonts w:ascii="Arial" w:hAnsi="Arial" w:eastAsia="Arial" w:cs="Arial"/>
-          <w:b/>
-          <w:i w:val="0"/>
-          <w:sz w:val="17"/>
-          <w:u w:val="none"/>
+          <w:rFonts w:ascii="Arial" w:cs="Arial" w:eastAsia="Arial" w:hAnsi="Arial"/>
+          <w:b w:val="1"/>
+          <w:bCs w:val="1"/>
+          <w:i w:val="0"/>
+          <w:iCs w:val="0"/>
+          <w:smallCaps w:val="0"/>
+          <w:strike w:val="0"/>
+          <w:color w:val="000000"/>
+          <w:sz w:val="18"/>
+          <w:szCs w:val="18"/>
+          <w:u w:val="none"/>
+          <w:shd w:fill="auto" w:val="clear"/>
+          <w:vertAlign w:val="baseline"/>
+          <w:rtl w:val="0"/>
+        </w:rPr>
+        <w:t xml:space="preserve">2025 IT Project Pro League - Encouragement Award</w:t>
+      </w:r>
+      <w:r>
+        <w:rPr>
+          <w:rFonts w:ascii="Arial" w:cs="Arial" w:eastAsia="Arial" w:hAnsi="Arial"/>
+          <w:b w:val="0"/>
+          <w:bCs w:val="0"/>
+          <w:i w:val="0"/>
+          <w:iCs w:val="0"/>
+          <w:smallCaps w:val="0"/>
+          <w:strike w:val="0"/>
+          <w:color w:val="000000"/>
+          <w:sz w:val="18"/>
+          <w:szCs w:val="18"/>
+          <w:u w:val="none"/>
+          <w:shd w:fill="auto" w:val="clear"/>
+          <w:vertAlign w:val="baseline"/>
+          <w:rtl w:val="0"/>
+        </w:rPr>
+        <w:t xml:space="preserve"> | Soongsil University Spartan SW Education Center</w:t>
+      </w:r>
+      <w:r>
+        <w:rPr>
+          <w:b w:val="1"/>
+          <w:bCs w:val="1"/>
+          <w:sz w:val="17"/>
+          <w:szCs w:val="17"/>
+          <w:rtl w:val="0"/>
         </w:rPr>
         <w:tab/>
       </w:r>
       <w:r>
         <w:rPr>
-          <w:rFonts w:ascii="Arial" w:hAnsi="Arial" w:eastAsia="Arial" w:cs="Arial"/>
-          <w:b/>
-          <w:i w:val="0"/>
-          <w:sz w:val="17"/>
-          <w:u w:val="none"/>
-        </w:rPr>
-        <w:t>18 Aug 2025</w:t>
+          <w:rFonts w:ascii="Arial" w:cs="Arial" w:eastAsia="Arial" w:hAnsi="Arial"/>
+          <w:b w:val="1"/>
+          <w:bCs w:val="1"/>
+          <w:i w:val="0"/>
+          <w:iCs w:val="0"/>
+          <w:smallCaps w:val="0"/>
+          <w:strike w:val="0"/>
+          <w:color w:val="000000"/>
+          <w:sz w:val="17"/>
+          <w:szCs w:val="17"/>
+          <w:u w:val="none"/>
+          <w:shd w:fill="auto" w:val="clear"/>
+          <w:vertAlign w:val="baseline"/>
+          <w:rtl w:val="0"/>
+        </w:rPr>
+        <w:t xml:space="preserve">22 Nov 2025</w:t>
+      </w:r>
+      <w:r>
+        <w:rPr>
+          <w:rtl w:val="0"/>
+        </w:rPr>
       </w:r>
     </w:p>
     <w:p>
@@ -2278,43 +2530,75 @@
       </w:pPr>
       <w:r>
         <w:rPr>
-          <w:rFonts w:ascii="Arial" w:hAnsi="Arial" w:eastAsia="Arial" w:cs="Arial"/>
-          <w:b/>
-          <w:i w:val="0"/>
-          <w:sz w:val="18"/>
-          <w:u w:val="none"/>
-        </w:rPr>
-        <w:t>15th Soongsil Capstone Design Competition - Encouragement Award</w:t>
-      </w:r>
-      <w:r>
-        <w:rPr>
-          <w:rFonts w:ascii="Arial" w:hAnsi="Arial" w:eastAsia="Arial" w:cs="Arial"/>
-          <w:b w:val="0"/>
-          <w:i w:val="0"/>
-          <w:sz w:val="18"/>
-          <w:u w:val="none"/>
+          <w:rFonts w:ascii="Arial" w:cs="Arial" w:eastAsia="Arial" w:hAnsi="Arial"/>
+          <w:b w:val="1"/>
+          <w:bCs w:val="1"/>
+          <w:i w:val="0"/>
+          <w:iCs w:val="0"/>
+          <w:smallCaps w:val="0"/>
+          <w:strike w:val="0"/>
+          <w:color w:val="000000"/>
+          <w:sz w:val="18"/>
+          <w:szCs w:val="18"/>
+          <w:u w:val="none"/>
+          <w:shd w:fill="auto" w:val="clear"/>
+          <w:vertAlign w:val="baseline"/>
+          <w:rtl w:val="0"/>
+        </w:rPr>
+        <w:t xml:space="preserve">15th Soongsil Capstone Design Competition - Encouragement Award</w:t>
+      </w:r>
+      <w:r>
+        <w:rPr>
+          <w:rFonts w:ascii="Arial" w:cs="Arial" w:eastAsia="Arial" w:hAnsi="Arial"/>
+          <w:b w:val="0"/>
+          <w:bCs w:val="0"/>
+          <w:i w:val="0"/>
+          <w:iCs w:val="0"/>
+          <w:smallCaps w:val="0"/>
+          <w:strike w:val="0"/>
+          <w:color w:val="000000"/>
+          <w:sz w:val="18"/>
+          <w:szCs w:val="18"/>
+          <w:u w:val="none"/>
+          <w:shd w:fill="auto" w:val="clear"/>
+          <w:vertAlign w:val="baseline"/>
+          <w:rtl w:val="0"/>
         </w:rPr>
         <w:t xml:space="preserve"> | Soongsil University</w:t>
       </w:r>
       <w:r>
         <w:rPr>
-          <w:rFonts w:ascii="Arial" w:hAnsi="Arial" w:eastAsia="Arial" w:cs="Arial"/>
-          <w:b/>
-          <w:i w:val="0"/>
-          <w:sz w:val="17"/>
-          <w:u w:val="none"/>
+          <w:b w:val="1"/>
+          <w:bCs w:val="1"/>
+          <w:sz w:val="17"/>
+          <w:szCs w:val="17"/>
+          <w:rtl w:val="0"/>
         </w:rPr>
         <w:tab/>
       </w:r>
       <w:r>
         <w:rPr>
-          <w:rFonts w:ascii="Arial" w:hAnsi="Arial" w:eastAsia="Arial" w:cs="Arial"/>
-          <w:b/>
-          <w:i w:val="0"/>
-          <w:sz w:val="17"/>
-          <w:u w:val="none"/>
-        </w:rPr>
-        <w:t>1 Oct 2025</w:t>
+          <w:rFonts w:ascii="Arial" w:cs="Arial" w:eastAsia="Arial" w:hAnsi="Arial"/>
+          <w:b w:val="1"/>
+          <w:bCs w:val="1"/>
+          <w:i w:val="0"/>
+          <w:iCs w:val="0"/>
+          <w:smallCaps w:val="0"/>
+          <w:strike w:val="0"/>
+          <w:color w:val="000000"/>
+          <w:sz w:val="17"/>
+          <w:szCs w:val="17"/>
+          <w:u w:val="none"/>
+          <w:shd w:fill="auto" w:val="clear"/>
+          <w:vertAlign w:val="baseline"/>
+          <w:rtl w:val="0"/>
+        </w:rPr>
+        <w:t xml:space="preserve">1 Oct 2025</w:t>
+      </w:r>
+      <w:r>
+        <w:rPr>
+          <w:rtl w:val="0"/>
+        </w:rPr>
       </w:r>
     </w:p>
     <w:p>
@@ -2355,43 +2639,184 @@
       </w:pPr>
       <w:r>
         <w:rPr>
-          <w:rFonts w:ascii="Arial" w:hAnsi="Arial" w:eastAsia="Arial" w:cs="Arial"/>
-          <w:b/>
-          <w:i w:val="0"/>
-          <w:sz w:val="18"/>
-          <w:u w:val="none"/>
-        </w:rPr>
-        <w:t>Engineer Information Processing (정보처리기사)</w:t>
-      </w:r>
-      <w:r>
-        <w:rPr>
-          <w:rFonts w:ascii="Arial" w:hAnsi="Arial" w:eastAsia="Arial" w:cs="Arial"/>
-          <w:b w:val="0"/>
-          <w:i w:val="0"/>
-          <w:sz w:val="18"/>
-          <w:u w:val="none"/>
+          <w:rFonts w:ascii="Arial" w:cs="Arial" w:eastAsia="Arial" w:hAnsi="Arial"/>
+          <w:b w:val="1"/>
+          <w:bCs w:val="1"/>
+          <w:i w:val="0"/>
+          <w:iCs w:val="0"/>
+          <w:smallCaps w:val="0"/>
+          <w:strike w:val="0"/>
+          <w:color w:val="000000"/>
+          <w:sz w:val="18"/>
+          <w:szCs w:val="18"/>
+          <w:u w:val="none"/>
+          <w:shd w:fill="auto" w:val="clear"/>
+          <w:vertAlign w:val="baseline"/>
+          <w:rtl w:val="0"/>
+        </w:rPr>
+        <w:t xml:space="preserve">2025 College of IT Software Competition - Gold Prize</w:t>
+      </w:r>
+      <w:r>
+        <w:rPr>
+          <w:rFonts w:ascii="Arial" w:cs="Arial" w:eastAsia="Arial" w:hAnsi="Arial"/>
+          <w:b w:val="0"/>
+          <w:bCs w:val="0"/>
+          <w:i w:val="0"/>
+          <w:iCs w:val="0"/>
+          <w:smallCaps w:val="0"/>
+          <w:strike w:val="0"/>
+          <w:color w:val="000000"/>
+          <w:sz w:val="18"/>
+          <w:szCs w:val="18"/>
+          <w:u w:val="none"/>
+          <w:shd w:fill="auto" w:val="clear"/>
+          <w:vertAlign w:val="baseline"/>
+          <w:rtl w:val="0"/>
+        </w:rPr>
+        <w:t xml:space="preserve"> | Soongsil University College of IT</w:t>
+      </w:r>
+      <w:r>
+        <w:rPr>
+          <w:b w:val="1"/>
+          <w:bCs w:val="1"/>
+          <w:sz w:val="17"/>
+          <w:szCs w:val="17"/>
+          <w:rtl w:val="0"/>
+        </w:rPr>
+        <w:tab/>
+      </w:r>
+      <w:r>
+        <w:rPr>
+          <w:rFonts w:ascii="Arial" w:cs="Arial" w:eastAsia="Arial" w:hAnsi="Arial"/>
+          <w:b w:val="1"/>
+          <w:bCs w:val="1"/>
+          <w:i w:val="0"/>
+          <w:iCs w:val="0"/>
+          <w:smallCaps w:val="0"/>
+          <w:strike w:val="0"/>
+          <w:color w:val="000000"/>
+          <w:sz w:val="17"/>
+          <w:szCs w:val="17"/>
+          <w:u w:val="none"/>
+          <w:shd w:fill="auto" w:val="clear"/>
+          <w:vertAlign w:val="baseline"/>
+          <w:rtl w:val="0"/>
+        </w:rPr>
+        <w:t xml:space="preserve">18 Aug 2025</w:t>
+      </w:r>
+      <w:r>
+        <w:rPr>
+          <w:rtl w:val="0"/>
+        </w:rPr>
+      </w:r>
+    </w:p>
+    <w:p>
+      <w:pPr>
+        <w:keepNext w:val="1"/>
+        <w:keepLines w:val="1"/>
+        <w:pageBreakBefore w:val="0"/>
+        <w:widowControl w:val="1"/>
+        <w:pBdr>
+          <w:top w:space="0" w:sz="0" w:val="nil"/>
+          <w:left w:space="0" w:sz="0" w:val="nil"/>
+          <w:bottom w:space="0" w:sz="0" w:val="nil"/>
+          <w:right w:space="0" w:sz="0" w:val="nil"/>
+          <w:between w:space="0" w:sz="0" w:val="nil"/>
+        </w:pBdr>
+        <w:shd w:fill="auto" w:val="clear"/>
+        <w:tabs>
+          <w:tab w:val="right" w:leader="none" w:pos="10178"/>
+        </w:tabs>
+        <w:spacing w:after="14" w:before="0" w:line="240" w:lineRule="auto"/>
+        <w:ind w:left="0" w:right="0" w:firstLine="0"/>
+        <w:jc w:val="left"/>
+        <w:rPr>
+          <w:rFonts w:ascii="Arial" w:cs="Arial" w:eastAsia="Arial" w:hAnsi="Arial"/>
+          <w:b w:val="0"/>
+          <w:bCs w:val="0"/>
+          <w:i w:val="0"/>
+          <w:iCs w:val="0"/>
+          <w:smallCaps w:val="0"/>
+          <w:strike w:val="0"/>
+          <w:color w:val="000000"/>
+          <w:sz w:val="18"/>
+          <w:szCs w:val="18"/>
+          <w:u w:val="none"/>
+          <w:shd w:fill="auto" w:val="clear"/>
+          <w:vertAlign w:val="baseline"/>
+        </w:rPr>
+      </w:pPr>
+      <w:r>
+        <w:rPr>
+          <w:rFonts w:ascii="Arial" w:cs="Arial" w:eastAsia="Arial" w:hAnsi="Arial"/>
+          <w:b w:val="1"/>
+          <w:bCs w:val="1"/>
+          <w:i w:val="0"/>
+          <w:iCs w:val="0"/>
+          <w:smallCaps w:val="0"/>
+          <w:strike w:val="0"/>
+          <w:color w:val="000000"/>
+          <w:sz w:val="18"/>
+          <w:szCs w:val="18"/>
+          <w:u w:val="none"/>
+          <w:shd w:fill="auto" w:val="clear"/>
+          <w:vertAlign w:val="baseline"/>
+          <w:rtl w:val="0"/>
+        </w:rPr>
+        <w:t xml:space="preserve">Engineer Information Processing</w:t>
+      </w:r>
+      <w:r>
+        <w:rPr>
+          <w:rFonts w:ascii="Arial" w:cs="Arial" w:eastAsia="Arial" w:hAnsi="Arial"/>
+          <w:b w:val="0"/>
+          <w:bCs w:val="0"/>
+          <w:i w:val="0"/>
+          <w:iCs w:val="0"/>
+          <w:smallCaps w:val="0"/>
+          <w:strike w:val="0"/>
+          <w:color w:val="000000"/>
+          <w:sz w:val="18"/>
+          <w:szCs w:val="18"/>
+          <w:u w:val="none"/>
+          <w:shd w:fill="auto" w:val="clear"/>
+          <w:vertAlign w:val="baseline"/>
+          <w:rtl w:val="0"/>
         </w:rPr>
         <w:t xml:space="preserve"> | National Technical Qualification, Ministry of Science and ICT</w:t>
       </w:r>
       <w:r>
         <w:rPr>
-          <w:rFonts w:ascii="Arial" w:hAnsi="Arial" w:eastAsia="Arial" w:cs="Arial"/>
-          <w:b/>
-          <w:i w:val="0"/>
-          <w:sz w:val="17"/>
-          <w:u w:val="none"/>
+          <w:b w:val="1"/>
+          <w:bCs w:val="1"/>
+          <w:sz w:val="17"/>
+          <w:szCs w:val="17"/>
+          <w:rtl w:val="0"/>
         </w:rPr>
         <w:tab/>
       </w:r>
       <w:r>
         <w:rPr>
-          <w:rFonts w:ascii="Arial" w:hAnsi="Arial" w:eastAsia="Arial" w:cs="Arial"/>
-          <w:b/>
-          <w:i w:val="0"/>
-          <w:sz w:val="17"/>
-          <w:u w:val="none"/>
-        </w:rPr>
-        <w:t>11 Sep 2026</w:t>
+          <w:rFonts w:ascii="Arial" w:cs="Arial" w:eastAsia="Arial" w:hAnsi="Arial"/>
+          <w:b w:val="1"/>
+          <w:bCs w:val="1"/>
+          <w:i w:val="0"/>
+          <w:iCs w:val="0"/>
+          <w:smallCaps w:val="0"/>
+          <w:strike w:val="0"/>
+          <w:color w:val="000000"/>
+          <w:sz w:val="17"/>
+          <w:szCs w:val="17"/>
+          <w:u w:val="none"/>
+          <w:shd w:fill="auto" w:val="clear"/>
+          <w:vertAlign w:val="baseline"/>
+          <w:rtl w:val="0"/>
+        </w:rPr>
+        <w:t xml:space="preserve">11 Sep 2026</w:t>
+      </w:r>
+      <w:r>
+        <w:rPr>
+          <w:rtl w:val="0"/>
+        </w:rPr>
       </w:r>
     </w:p>
     <w:p>
@@ -2742,7 +3167,7 @@
     <w:next w:val="Normal"/>
     <w:pPr>
       <w:pBdr>
-        <w:bottom w:color="4f81bd" w:space="4" w:sz="8" w:val="single"/>
+        <w:bottom w:color="000000" w:space="4" w:sz="8" w:val="single"/>
       </w:pBdr>
       <w:spacing w:after="300" w:line="240" w:lineRule="auto"/>
     </w:pPr>

</xml_diff>